<commit_message>
Fix document-generation footer, address, and HCD bugs
- Codicil footers: remove stray legacy path, make page totals live
  (of 4 hardcode + NUMPAGES fldSimple -> live complex fields)
- Page totals: convert SECTIONPAGES fldSimple -> complex in HCD, HIPAA,
  and Will footers so Word recomputes the total instead of a stale value
- Will TOC: mark fields for update so the table of contents rebuilds on open
- Address blocks: collapse three blank lines to a single break in
  BlockAddress (individual, individual2, party models)
- HCD: map the Geaux-branch variables so Nutrition/Hydration selections
  render (GeauxHCD*None / Geaux*HCDs)
- CardText page count made live in pourover/attestation templates

Co-Authored-By: Claude Opus 4.5 <noreply@anthropic.com>
</commit_message>
<xml_diff>
--- a/geauxplans-backend/data/templates/ClientHCD.docx
+++ b/geauxplans-backend/data/templates/ClientHCD.docx
@@ -5399,14 +5399,24 @@
     <w:r>
       <w:sym w:font="WP Phonetic" w:char="F020"/>
     </w:r>
-    <w:fldSimple w:instr=" SECTIONPAGES  \* Arabic  \* MERGEFORMAT ">
-      <w:r>
-        <w:rPr>
-          <w:noProof/>
-        </w:rPr>
-        <w:t>5</w:t>
-      </w:r>
-    </w:fldSimple>
+    <w:r>
+      <w:fldChar w:fldCharType="begin"/>
+    </w:r>
+    <w:r>
+      <w:instrText xml:space="preserve"> SECTIONPAGES  \* Arabic  \* MERGEFORMAT </w:instrText>
+    </w:r>
+    <w:r>
+      <w:fldChar w:fldCharType="separate"/>
+    </w:r>
+    <w:r>
+      <w:rPr>
+        <w:noProof/>
+      </w:rPr>
+      <w:t>5</w:t>
+    </w:r>
+    <w:r>
+      <w:fldChar w:fldCharType="end"/>
+    </w:r>
   </w:p>
 </w:ftr>
 </file>

</xml_diff>